<commit_message>
Finalize midterm evaluation report
</commit_message>
<xml_diff>
--- a/Midterm_Report_2025100332_Cloud_Updated.docx
+++ b/Midterm_Report_2025100332_Cloud_Updated.docx
@@ -1142,7 +1142,7 @@
                 <w:rFonts w:ascii="Noto Sans CJK KR" w:hAnsi="Noto Sans CJK KR"/>
                 <w:sz w:val="12"/>
               </w:rPr>
-              <w:t>진행중</w:t>
+              <w:t>완료</w:t>
             </w:r>
           </w:p>
         </w:tc>
@@ -1160,9 +1160,11 @@
             <w:r>
               <w:rPr>
                 <w:rFonts w:ascii="Noto Sans CJK KR" w:hAnsi="Noto Sans CJK KR"/>
+                <w:b/>
+                <w:color w:val="146A48"/>
                 <w:sz w:val="18"/>
               </w:rPr>
-              <w:t>—</w:t>
+              <w:t>○</w:t>
             </w:r>
           </w:p>
         </w:tc>
@@ -5050,14 +5052,13 @@
           <w:b/>
           <w:sz w:val="20"/>
         </w:rPr>
-        <w:t xml:space="preserve">제출 전 확인  </w:t>
+        <w:t>제출 전 확인  ID 2: 최종 보고서 및 소스코드의 GitHub main 브랜치 업로드 확인 (보고서 commit 5b7237e, 최종 README commit 7357ea9)</w:t>
       </w:r>
       <w:r>
         <w:rPr>
           <w:rFonts w:ascii="Noto Sans CJK KR" w:hAnsi="Noto Sans CJK KR"/>
           <w:sz w:val="20"/>
         </w:rPr>
-        <w:t>ID 2: 본 수정본 Word 보고서 GitHub push 후 최종 링크 확인 필요 (소스코드는 origin/main에 반영됨)</w:t>
       </w:r>
     </w:p>
     <w:p>
@@ -5240,7 +5241,7 @@
           <w:rFonts w:ascii="Noto Sans CJK KR" w:hAnsi="Noto Sans CJK KR"/>
           <w:sz w:val="18"/>
         </w:rPr>
-        <w:t>git push 결과에서 main -&gt; main 및 origin/main 추적 확인. 보고서 추가 push는 별도 필요.</w:t>
+        <w:t>git push 결과에서 main -&gt; main 및 origin/main 추적 확인. Word 보고서 및 클라우드 소스 수정사항이 GitHub 저장소에 반영됨.</w:t>
       </w:r>
     </w:p>
     <w:p>

</xml_diff>